<commit_message>
Validate review claims and generate factual explanations
</commit_message>
<xml_diff>
--- a/Performance_Evaluation.docx
+++ b/Performance_Evaluation.docx
@@ -4,234 +4,1578 @@
   <w:body>
     <w:p>
       <w:r>
-        <w:t>AI Study Planner — Performance Evaluation</w:t>
-      </w:r>
-    </w:p>
-    <w:p>
-      <w:pPr>
-        <w:numPr>
-          <w:ilvl w:val="0"/>
-          <w:numId w:val="1"/>
-        </w:numPr>
-      </w:pPr>
+        <w:t>AI Study Planner Performance Evaluation</w:t>
+      </w:r>
+    </w:p>
+    <w:p>
+      <w:r>
+        <w:t>Haya Alqaisi | Updated 16 October 2026</w:t>
+      </w:r>
+    </w:p>
+    <w:p>
       <w:r>
         <w:t>Purpose</w:t>
       </w:r>
     </w:p>
     <w:p>
       <w:r>
-        <w:t>This document reports the performance of the AI syllabus topic extraction feature. The evaluation measured how closely extracted topic titles matched predefined reference titles, how long extraction took, and the Python process’s memory use.</w:t>
-      </w:r>
-    </w:p>
-    <w:p>
-      <w:pPr>
-        <w:numPr>
-          <w:ilvl w:val="0"/>
-          <w:numId w:val="2"/>
-        </w:numPr>
-      </w:pPr>
+        <w:t>This report evaluates syllabus topic extraction and AI-assisted study-plan review. The latest review run completed 60 of 60 attempts, matched the defined action and preference rubrics, and passed the final explanation checks. These are results on repeated synthetic scenarios, not proof that the project is error-free.</w:t>
+      </w:r>
+    </w:p>
+    <w:p>
       <w:r>
         <w:t>Evaluation Method</w:t>
       </w:r>
     </w:p>
     <w:p>
       <w:r>
-        <w:t>The evaluation used three synthetic syllabus cases, repeated three times each, for nine attempts in total. Each extracted title was compared with a predefined reference title after normalizing letter case and whitespace. Failed extractions would count as missing expected topics.</w:t>
-      </w:r>
-    </w:p>
-    <w:p>
-      <w:r>
-        <w:t>Response time covers topic extraction and validation. Memory readings are samples of the entire local Python process before and after an attempt. They are not peak-memory measurements and do not measure only the AI component.</w:t>
-      </w:r>
-    </w:p>
-    <w:p>
-      <w:pPr>
-        <w:numPr>
-          <w:ilvl w:val="0"/>
-          <w:numId w:val="3"/>
-        </w:numPr>
-      </w:pPr>
+        <w:t>Topic extraction uses six synthetic syllabi repeated three times, producing 18 attempts. The cases include administrative text, weekly tables, numbered subtopics, and repeated content. Extracted titles are compared with predefined references using normalized exact matching and character-based fuzzy matching at a threshold of 0.85. Fuzzy assignments are one-to-one; duplicate predictions count against precision.</w:t>
+      </w:r>
+    </w:p>
+    <w:p>
+      <w:r>
+        <w:t>Plan review uses six synthetic scenarios repeated ten times, producing 60 attempts per run. The scenarios cover completed work, missed work with each preference, completed work consuming capacity, an insufficient daily maximum, and an exam deadline reached at the resume date. The real scheduler calculates feasible replacement options.</w:t>
+      </w:r>
+    </w:p>
+    <w:p>
+      <w:r>
+        <w:t>The action rubric checks the expected outcome. For manageable workload, the preference rubric selects the lowest feasible daily limit. For finishing sooner, it selects the earliest finish and then the lowest limit achieving that date. These expectations are benchmark choices, not universal measures of the best recommendation.</w:t>
+      </w:r>
+    </w:p>
+    <w:p>
+      <w:r>
+        <w:t>Measurement Scope</w:t>
+      </w:r>
+    </w:p>
+    <w:p>
+      <w:r>
+        <w:t>Duration measures the feature call and application validation. Review duration also includes explanation repair when needed and final explanation generation, but excludes scheduling-option generation and evaluation scoring. Memory readings sample the entire Python process before and after each attempt. They are not peak measurements, isolated AI memory, or remote model memory. MB values below use decimal units.</w:t>
+      </w:r>
+    </w:p>
+    <w:p>
+      <w:r>
+        <w:t>October 16 plan-review results are recorded from the local evaluation summaries. Exact filenames appear in the report references. The expanded topic results come from the saved October 15 report.</w:t>
+      </w:r>
+    </w:p>
+    <w:p>
       <w:r>
         <w:t>Results</w:t>
       </w:r>
     </w:p>
     <w:p>
-      <w:pPr>
-        <w:numPr>
-          <w:ilvl w:val="0"/>
-          <w:numId w:val="4"/>
-        </w:numPr>
-      </w:pPr>
-      <w:r>
-        <w:t>Attempts: 9</w:t>
-      </w:r>
-    </w:p>
-    <w:p>
-      <w:pPr>
-        <w:numPr>
-          <w:ilvl w:val="0"/>
-          <w:numId w:val="4"/>
-        </w:numPr>
-      </w:pPr>
-      <w:r>
-        <w:t>Successful attempts: 9</w:t>
-      </w:r>
-    </w:p>
-    <w:p>
-      <w:pPr>
-        <w:numPr>
-          <w:ilvl w:val="0"/>
-          <w:numId w:val="4"/>
-        </w:numPr>
-      </w:pPr>
-      <w:r>
-        <w:t>Failed attempts: 0</w:t>
-      </w:r>
-    </w:p>
-    <w:p>
-      <w:pPr>
-        <w:numPr>
-          <w:ilvl w:val="0"/>
-          <w:numId w:val="4"/>
-        </w:numPr>
-      </w:pPr>
-      <w:r>
-        <w:t>Micro precision: 0.926</w:t>
-      </w:r>
-    </w:p>
-    <w:p>
-      <w:pPr>
-        <w:numPr>
-          <w:ilvl w:val="0"/>
-          <w:numId w:val="4"/>
-        </w:numPr>
-      </w:pPr>
-      <w:r>
-        <w:t>Micro recall: 0.926</w:t>
-      </w:r>
-    </w:p>
-    <w:p>
-      <w:pPr>
-        <w:numPr>
-          <w:ilvl w:val="0"/>
-          <w:numId w:val="4"/>
-        </w:numPr>
-      </w:pPr>
-      <w:r>
-        <w:t>Micro F1 score: 0.926</w:t>
-      </w:r>
-    </w:p>
-    <w:p>
-      <w:pPr>
-        <w:numPr>
-          <w:ilvl w:val="0"/>
-          <w:numId w:val="4"/>
-        </w:numPr>
-      </w:pPr>
-      <w:r>
-        <w:t xml:space="preserve">Average response time: 1,468 </w:t>
+      <w:r>
+        <w:t>Topic extraction results</w:t>
+      </w:r>
+    </w:p>
+    <w:tbl>
+      <w:tblPr>
+        <w:tblW w:w="0" w:type="dxa"/>
+        <w:tblBorders>
+          <w:top w:val="single" w:sz="2" w:space="0" w:color="auto"/>
+          <w:left w:val="single" w:sz="2" w:space="0" w:color="auto"/>
+          <w:bottom w:val="single" w:sz="2" w:space="0" w:color="auto"/>
+          <w:right w:val="single" w:sz="2" w:space="0" w:color="auto"/>
+        </w:tblBorders>
+        <w:tblLook w:val="04A0" w:firstRow="1" w:lastRow="0" w:firstColumn="1" w:lastColumn="0" w:noHBand="0" w:noVBand="1"/>
+      </w:tblPr>
+      <w:tblGrid>
+        <w:gridCol w:w="5454"/>
+        <w:gridCol w:w="3896"/>
+      </w:tblGrid>
+      <w:tr>
+        <w:tc>
+          <w:tcPr>
+            <w:tcW w:w="5904" w:type="dxa"/>
+            <w:tcBorders>
+              <w:top w:val="single" w:sz="4" w:space="0" w:color="D9D9D9"/>
+              <w:left w:val="single" w:sz="4" w:space="0" w:color="D9D9D9"/>
+              <w:bottom w:val="single" w:sz="4" w:space="0" w:color="D9D9D9"/>
+              <w:right w:val="single" w:sz="4" w:space="0" w:color="D9D9D9"/>
+            </w:tcBorders>
+            <w:shd w:val="clear" w:color="auto" w:fill="E7EDF2"/>
+            <w:tcMar>
+              <w:top w:w="85" w:type="dxa"/>
+              <w:left w:w="85" w:type="dxa"/>
+              <w:bottom w:w="85" w:type="dxa"/>
+              <w:right w:w="85" w:type="dxa"/>
+            </w:tcMar>
+            <w:vAlign w:val="center"/>
+            <w:hideMark/>
+          </w:tcPr>
+          <w:p>
+            <w:r>
+              <w:rPr>
+                <w:b/>
+                <w:bCs/>
+              </w:rPr>
+              <w:lastRenderedPageBreak/>
+              <w:t>Metric</w:t>
+            </w:r>
+          </w:p>
+        </w:tc>
+        <w:tc>
+          <w:tcPr>
+            <w:tcW w:w="4176" w:type="dxa"/>
+            <w:tcBorders>
+              <w:top w:val="single" w:sz="4" w:space="0" w:color="D9D9D9"/>
+              <w:left w:val="single" w:sz="4" w:space="0" w:color="D9D9D9"/>
+              <w:bottom w:val="single" w:sz="4" w:space="0" w:color="D9D9D9"/>
+              <w:right w:val="single" w:sz="4" w:space="0" w:color="D9D9D9"/>
+            </w:tcBorders>
+            <w:shd w:val="clear" w:color="auto" w:fill="E7EDF2"/>
+            <w:tcMar>
+              <w:top w:w="85" w:type="dxa"/>
+              <w:left w:w="85" w:type="dxa"/>
+              <w:bottom w:w="85" w:type="dxa"/>
+              <w:right w:w="85" w:type="dxa"/>
+            </w:tcMar>
+            <w:vAlign w:val="center"/>
+            <w:hideMark/>
+          </w:tcPr>
+          <w:p>
+            <w:r>
+              <w:rPr>
+                <w:b/>
+                <w:bCs/>
+              </w:rPr>
+              <w:t>Expanded evaluation</w:t>
+            </w:r>
+          </w:p>
+        </w:tc>
+      </w:tr>
+      <w:tr>
+        <w:tc>
+          <w:tcPr>
+            <w:tcW w:w="5904" w:type="dxa"/>
+            <w:tcBorders>
+              <w:top w:val="single" w:sz="4" w:space="0" w:color="D9D9D9"/>
+              <w:left w:val="single" w:sz="4" w:space="0" w:color="D9D9D9"/>
+              <w:bottom w:val="single" w:sz="4" w:space="0" w:color="D9D9D9"/>
+              <w:right w:val="single" w:sz="4" w:space="0" w:color="D9D9D9"/>
+            </w:tcBorders>
+            <w:shd w:val="clear" w:color="auto" w:fill="FFFFFF"/>
+            <w:tcMar>
+              <w:top w:w="85" w:type="dxa"/>
+              <w:left w:w="85" w:type="dxa"/>
+              <w:bottom w:w="85" w:type="dxa"/>
+              <w:right w:w="85" w:type="dxa"/>
+            </w:tcMar>
+            <w:vAlign w:val="center"/>
+            <w:hideMark/>
+          </w:tcPr>
+          <w:p>
+            <w:r>
+              <w:t>Cases and repetitions</w:t>
+            </w:r>
+          </w:p>
+        </w:tc>
+        <w:tc>
+          <w:tcPr>
+            <w:tcW w:w="4176" w:type="dxa"/>
+            <w:tcBorders>
+              <w:top w:val="single" w:sz="4" w:space="0" w:color="D9D9D9"/>
+              <w:left w:val="single" w:sz="4" w:space="0" w:color="D9D9D9"/>
+              <w:bottom w:val="single" w:sz="4" w:space="0" w:color="D9D9D9"/>
+              <w:right w:val="single" w:sz="4" w:space="0" w:color="D9D9D9"/>
+            </w:tcBorders>
+            <w:shd w:val="clear" w:color="auto" w:fill="FFFFFF"/>
+            <w:tcMar>
+              <w:top w:w="85" w:type="dxa"/>
+              <w:left w:w="85" w:type="dxa"/>
+              <w:bottom w:w="85" w:type="dxa"/>
+              <w:right w:w="85" w:type="dxa"/>
+            </w:tcMar>
+            <w:vAlign w:val="center"/>
+            <w:hideMark/>
+          </w:tcPr>
+          <w:p>
+            <w:r>
+              <w:t>6 cases x 3</w:t>
+            </w:r>
+          </w:p>
+        </w:tc>
+      </w:tr>
+      <w:tr>
+        <w:tc>
+          <w:tcPr>
+            <w:tcW w:w="5904" w:type="dxa"/>
+            <w:tcBorders>
+              <w:top w:val="single" w:sz="4" w:space="0" w:color="D9D9D9"/>
+              <w:left w:val="single" w:sz="4" w:space="0" w:color="D9D9D9"/>
+              <w:bottom w:val="single" w:sz="4" w:space="0" w:color="D9D9D9"/>
+              <w:right w:val="single" w:sz="4" w:space="0" w:color="D9D9D9"/>
+            </w:tcBorders>
+            <w:shd w:val="clear" w:color="auto" w:fill="F7F8FA"/>
+            <w:tcMar>
+              <w:top w:w="85" w:type="dxa"/>
+              <w:left w:w="85" w:type="dxa"/>
+              <w:bottom w:w="85" w:type="dxa"/>
+              <w:right w:w="85" w:type="dxa"/>
+            </w:tcMar>
+            <w:vAlign w:val="center"/>
+            <w:hideMark/>
+          </w:tcPr>
+          <w:p>
+            <w:r>
+              <w:t>Successful attempts</w:t>
+            </w:r>
+          </w:p>
+        </w:tc>
+        <w:tc>
+          <w:tcPr>
+            <w:tcW w:w="4176" w:type="dxa"/>
+            <w:tcBorders>
+              <w:top w:val="single" w:sz="4" w:space="0" w:color="D9D9D9"/>
+              <w:left w:val="single" w:sz="4" w:space="0" w:color="D9D9D9"/>
+              <w:bottom w:val="single" w:sz="4" w:space="0" w:color="D9D9D9"/>
+              <w:right w:val="single" w:sz="4" w:space="0" w:color="D9D9D9"/>
+            </w:tcBorders>
+            <w:shd w:val="clear" w:color="auto" w:fill="F7F8FA"/>
+            <w:tcMar>
+              <w:top w:w="85" w:type="dxa"/>
+              <w:left w:w="85" w:type="dxa"/>
+              <w:bottom w:w="85" w:type="dxa"/>
+              <w:right w:w="85" w:type="dxa"/>
+            </w:tcMar>
+            <w:vAlign w:val="center"/>
+            <w:hideMark/>
+          </w:tcPr>
+          <w:p>
+            <w:r>
+              <w:t>18 / 18</w:t>
+            </w:r>
+          </w:p>
+        </w:tc>
+      </w:tr>
+      <w:tr>
+        <w:tc>
+          <w:tcPr>
+            <w:tcW w:w="5904" w:type="dxa"/>
+            <w:tcBorders>
+              <w:top w:val="single" w:sz="4" w:space="0" w:color="D9D9D9"/>
+              <w:left w:val="single" w:sz="4" w:space="0" w:color="D9D9D9"/>
+              <w:bottom w:val="single" w:sz="4" w:space="0" w:color="D9D9D9"/>
+              <w:right w:val="single" w:sz="4" w:space="0" w:color="D9D9D9"/>
+            </w:tcBorders>
+            <w:shd w:val="clear" w:color="auto" w:fill="FFFFFF"/>
+            <w:tcMar>
+              <w:top w:w="85" w:type="dxa"/>
+              <w:left w:w="85" w:type="dxa"/>
+              <w:bottom w:w="85" w:type="dxa"/>
+              <w:right w:w="85" w:type="dxa"/>
+            </w:tcMar>
+            <w:vAlign w:val="center"/>
+            <w:hideMark/>
+          </w:tcPr>
+          <w:p>
+            <w:r>
+              <w:t>Exact micro precision recall and F1</w:t>
+            </w:r>
+          </w:p>
+        </w:tc>
+        <w:tc>
+          <w:tcPr>
+            <w:tcW w:w="4176" w:type="dxa"/>
+            <w:tcBorders>
+              <w:top w:val="single" w:sz="4" w:space="0" w:color="D9D9D9"/>
+              <w:left w:val="single" w:sz="4" w:space="0" w:color="D9D9D9"/>
+              <w:bottom w:val="single" w:sz="4" w:space="0" w:color="D9D9D9"/>
+              <w:right w:val="single" w:sz="4" w:space="0" w:color="D9D9D9"/>
+            </w:tcBorders>
+            <w:shd w:val="clear" w:color="auto" w:fill="FFFFFF"/>
+            <w:tcMar>
+              <w:top w:w="85" w:type="dxa"/>
+              <w:left w:w="85" w:type="dxa"/>
+              <w:bottom w:w="85" w:type="dxa"/>
+              <w:right w:w="85" w:type="dxa"/>
+            </w:tcMar>
+            <w:vAlign w:val="center"/>
+            <w:hideMark/>
+          </w:tcPr>
+          <w:p>
+            <w:r>
+              <w:t>0.9487 each</w:t>
+            </w:r>
+          </w:p>
+        </w:tc>
+      </w:tr>
+      <w:tr>
+        <w:tc>
+          <w:tcPr>
+            <w:tcW w:w="5904" w:type="dxa"/>
+            <w:tcBorders>
+              <w:top w:val="single" w:sz="4" w:space="0" w:color="D9D9D9"/>
+              <w:left w:val="single" w:sz="4" w:space="0" w:color="D9D9D9"/>
+              <w:bottom w:val="single" w:sz="4" w:space="0" w:color="D9D9D9"/>
+              <w:right w:val="single" w:sz="4" w:space="0" w:color="D9D9D9"/>
+            </w:tcBorders>
+            <w:shd w:val="clear" w:color="auto" w:fill="F7F8FA"/>
+            <w:tcMar>
+              <w:top w:w="85" w:type="dxa"/>
+              <w:left w:w="85" w:type="dxa"/>
+              <w:bottom w:w="85" w:type="dxa"/>
+              <w:right w:w="85" w:type="dxa"/>
+            </w:tcMar>
+            <w:vAlign w:val="center"/>
+            <w:hideMark/>
+          </w:tcPr>
+          <w:p>
+            <w:r>
+              <w:t>Fuzzy micro precision recall and F1</w:t>
+            </w:r>
+          </w:p>
+        </w:tc>
+        <w:tc>
+          <w:tcPr>
+            <w:tcW w:w="4176" w:type="dxa"/>
+            <w:tcBorders>
+              <w:top w:val="single" w:sz="4" w:space="0" w:color="D9D9D9"/>
+              <w:left w:val="single" w:sz="4" w:space="0" w:color="D9D9D9"/>
+              <w:bottom w:val="single" w:sz="4" w:space="0" w:color="D9D9D9"/>
+              <w:right w:val="single" w:sz="4" w:space="0" w:color="D9D9D9"/>
+            </w:tcBorders>
+            <w:shd w:val="clear" w:color="auto" w:fill="F7F8FA"/>
+            <w:tcMar>
+              <w:top w:w="85" w:type="dxa"/>
+              <w:left w:w="85" w:type="dxa"/>
+              <w:bottom w:w="85" w:type="dxa"/>
+              <w:right w:w="85" w:type="dxa"/>
+            </w:tcMar>
+            <w:vAlign w:val="center"/>
+            <w:hideMark/>
+          </w:tcPr>
+          <w:p>
+            <w:r>
+              <w:t>0.9487 each</w:t>
+            </w:r>
+          </w:p>
+        </w:tc>
+      </w:tr>
+      <w:tr>
+        <w:tc>
+          <w:tcPr>
+            <w:tcW w:w="5904" w:type="dxa"/>
+            <w:tcBorders>
+              <w:top w:val="single" w:sz="4" w:space="0" w:color="D9D9D9"/>
+              <w:left w:val="single" w:sz="4" w:space="0" w:color="D9D9D9"/>
+              <w:bottom w:val="single" w:sz="4" w:space="0" w:color="D9D9D9"/>
+              <w:right w:val="single" w:sz="4" w:space="0" w:color="D9D9D9"/>
+            </w:tcBorders>
+            <w:shd w:val="clear" w:color="auto" w:fill="FFFFFF"/>
+            <w:tcMar>
+              <w:top w:w="85" w:type="dxa"/>
+              <w:left w:w="85" w:type="dxa"/>
+              <w:bottom w:w="85" w:type="dxa"/>
+              <w:right w:w="85" w:type="dxa"/>
+            </w:tcMar>
+            <w:vAlign w:val="center"/>
+            <w:hideMark/>
+          </w:tcPr>
+          <w:p>
+            <w:r>
+              <w:t>Average duration</w:t>
+            </w:r>
+          </w:p>
+        </w:tc>
+        <w:tc>
+          <w:tcPr>
+            <w:tcW w:w="4176" w:type="dxa"/>
+            <w:tcBorders>
+              <w:top w:val="single" w:sz="4" w:space="0" w:color="D9D9D9"/>
+              <w:left w:val="single" w:sz="4" w:space="0" w:color="D9D9D9"/>
+              <w:bottom w:val="single" w:sz="4" w:space="0" w:color="D9D9D9"/>
+              <w:right w:val="single" w:sz="4" w:space="0" w:color="D9D9D9"/>
+            </w:tcBorders>
+            <w:shd w:val="clear" w:color="auto" w:fill="FFFFFF"/>
+            <w:tcMar>
+              <w:top w:w="85" w:type="dxa"/>
+              <w:left w:w="85" w:type="dxa"/>
+              <w:bottom w:w="85" w:type="dxa"/>
+              <w:right w:w="85" w:type="dxa"/>
+            </w:tcMar>
+            <w:vAlign w:val="center"/>
+            <w:hideMark/>
+          </w:tcPr>
+          <w:p>
+            <w:r>
+              <w:t xml:space="preserve">2084.67 </w:t>
+            </w:r>
+            <w:proofErr w:type="spellStart"/>
+            <w:r>
+              <w:t>ms</w:t>
+            </w:r>
+            <w:proofErr w:type="spellEnd"/>
+          </w:p>
+        </w:tc>
+      </w:tr>
+      <w:tr>
+        <w:tc>
+          <w:tcPr>
+            <w:tcW w:w="5904" w:type="dxa"/>
+            <w:tcBorders>
+              <w:top w:val="single" w:sz="4" w:space="0" w:color="D9D9D9"/>
+              <w:left w:val="single" w:sz="4" w:space="0" w:color="D9D9D9"/>
+              <w:bottom w:val="single" w:sz="4" w:space="0" w:color="D9D9D9"/>
+              <w:right w:val="single" w:sz="4" w:space="0" w:color="D9D9D9"/>
+            </w:tcBorders>
+            <w:shd w:val="clear" w:color="auto" w:fill="F7F8FA"/>
+            <w:tcMar>
+              <w:top w:w="85" w:type="dxa"/>
+              <w:left w:w="85" w:type="dxa"/>
+              <w:bottom w:w="85" w:type="dxa"/>
+              <w:right w:w="85" w:type="dxa"/>
+            </w:tcMar>
+            <w:vAlign w:val="center"/>
+            <w:hideMark/>
+          </w:tcPr>
+          <w:p>
+            <w:r>
+              <w:t>Average process memory afterward</w:t>
+            </w:r>
+          </w:p>
+        </w:tc>
+        <w:tc>
+          <w:tcPr>
+            <w:tcW w:w="4176" w:type="dxa"/>
+            <w:tcBorders>
+              <w:top w:val="single" w:sz="4" w:space="0" w:color="D9D9D9"/>
+              <w:left w:val="single" w:sz="4" w:space="0" w:color="D9D9D9"/>
+              <w:bottom w:val="single" w:sz="4" w:space="0" w:color="D9D9D9"/>
+              <w:right w:val="single" w:sz="4" w:space="0" w:color="D9D9D9"/>
+            </w:tcBorders>
+            <w:shd w:val="clear" w:color="auto" w:fill="F7F8FA"/>
+            <w:tcMar>
+              <w:top w:w="85" w:type="dxa"/>
+              <w:left w:w="85" w:type="dxa"/>
+              <w:bottom w:w="85" w:type="dxa"/>
+              <w:right w:w="85" w:type="dxa"/>
+            </w:tcMar>
+            <w:vAlign w:val="center"/>
+            <w:hideMark/>
+          </w:tcPr>
+          <w:p>
+            <w:r>
+              <w:t>98.61 MB</w:t>
+            </w:r>
+          </w:p>
+        </w:tc>
+      </w:tr>
+    </w:tbl>
+    <w:p>
+      <w:r>
+        <w:t xml:space="preserve">Fuzzy matching added no matches at the chosen threshold. These title scores do not measure semantic equivalence, topic descriptions, topic ordering, or PDF extraction quality. The original three-case, nine-attempt evaluation remains historical evidence: F1 was approximately 0.926 and average duration was approximately 1468 </w:t>
       </w:r>
       <w:proofErr w:type="spellStart"/>
       <w:r>
-        <w:t>ms</w:t>
+        <w:t>ms.</w:t>
       </w:r>
       <w:proofErr w:type="spellEnd"/>
-      <w:r>
-        <w:t xml:space="preserve"> (about 1.47 seconds)</w:t>
-      </w:r>
-    </w:p>
-    <w:p>
-      <w:pPr>
-        <w:numPr>
-          <w:ilvl w:val="0"/>
-          <w:numId w:val="4"/>
-        </w:numPr>
-      </w:pPr>
-      <w:r>
-        <w:t>Average process memory after an attempt: about 71.98 MB</w:t>
-      </w:r>
-    </w:p>
-    <w:p>
-      <w:pPr>
-        <w:numPr>
-          <w:ilvl w:val="0"/>
-          <w:numId w:val="4"/>
-        </w:numPr>
-      </w:pPr>
-      <w:r>
-        <w:t>Average process memory change during an attempt: about 2.33 MB</w:t>
-      </w:r>
-    </w:p>
-    <w:p>
-      <w:pPr>
-        <w:numPr>
-          <w:ilvl w:val="0"/>
-          <w:numId w:val="5"/>
-        </w:numPr>
-      </w:pPr>
+    </w:p>
+    <w:p>
+      <w:r>
+        <w:t>Plan review results on 16 October</w:t>
+      </w:r>
+    </w:p>
+    <w:tbl>
+      <w:tblPr>
+        <w:tblW w:w="0" w:type="dxa"/>
+        <w:tblBorders>
+          <w:top w:val="single" w:sz="2" w:space="0" w:color="auto"/>
+          <w:left w:val="single" w:sz="2" w:space="0" w:color="auto"/>
+          <w:bottom w:val="single" w:sz="2" w:space="0" w:color="auto"/>
+          <w:right w:val="single" w:sz="2" w:space="0" w:color="auto"/>
+        </w:tblBorders>
+        <w:tblLook w:val="04A0" w:firstRow="1" w:lastRow="0" w:firstColumn="1" w:lastColumn="0" w:noHBand="0" w:noVBand="1"/>
+      </w:tblPr>
+      <w:tblGrid>
+        <w:gridCol w:w="3258"/>
+        <w:gridCol w:w="1749"/>
+        <w:gridCol w:w="2352"/>
+        <w:gridCol w:w="1991"/>
+      </w:tblGrid>
+      <w:tr>
+        <w:tc>
+          <w:tcPr>
+            <w:tcW w:w="3600" w:type="dxa"/>
+            <w:tcBorders>
+              <w:top w:val="single" w:sz="4" w:space="0" w:color="D9D9D9"/>
+              <w:left w:val="single" w:sz="4" w:space="0" w:color="D9D9D9"/>
+              <w:bottom w:val="single" w:sz="4" w:space="0" w:color="D9D9D9"/>
+              <w:right w:val="single" w:sz="4" w:space="0" w:color="D9D9D9"/>
+            </w:tcBorders>
+            <w:shd w:val="clear" w:color="auto" w:fill="E7EDF2"/>
+            <w:tcMar>
+              <w:top w:w="85" w:type="dxa"/>
+              <w:left w:w="85" w:type="dxa"/>
+              <w:bottom w:w="85" w:type="dxa"/>
+              <w:right w:w="85" w:type="dxa"/>
+            </w:tcMar>
+            <w:vAlign w:val="center"/>
+            <w:hideMark/>
+          </w:tcPr>
+          <w:p>
+            <w:r>
+              <w:rPr>
+                <w:b/>
+                <w:bCs/>
+              </w:rPr>
+              <w:t>Metric</w:t>
+            </w:r>
+          </w:p>
+        </w:tc>
+        <w:tc>
+          <w:tcPr>
+            <w:tcW w:w="1872" w:type="dxa"/>
+            <w:tcBorders>
+              <w:top w:val="single" w:sz="4" w:space="0" w:color="D9D9D9"/>
+              <w:left w:val="single" w:sz="4" w:space="0" w:color="D9D9D9"/>
+              <w:bottom w:val="single" w:sz="4" w:space="0" w:color="D9D9D9"/>
+              <w:right w:val="single" w:sz="4" w:space="0" w:color="D9D9D9"/>
+            </w:tcBorders>
+            <w:shd w:val="clear" w:color="auto" w:fill="E7EDF2"/>
+            <w:tcMar>
+              <w:top w:w="85" w:type="dxa"/>
+              <w:left w:w="85" w:type="dxa"/>
+              <w:bottom w:w="85" w:type="dxa"/>
+              <w:right w:w="85" w:type="dxa"/>
+            </w:tcMar>
+            <w:vAlign w:val="center"/>
+            <w:hideMark/>
+          </w:tcPr>
+          <w:p>
+            <w:r>
+              <w:rPr>
+                <w:b/>
+                <w:bCs/>
+              </w:rPr>
+              <w:t>Baseline</w:t>
+            </w:r>
+          </w:p>
+        </w:tc>
+        <w:tc>
+          <w:tcPr>
+            <w:tcW w:w="2520" w:type="dxa"/>
+            <w:tcBorders>
+              <w:top w:val="single" w:sz="4" w:space="0" w:color="D9D9D9"/>
+              <w:left w:val="single" w:sz="4" w:space="0" w:color="D9D9D9"/>
+              <w:bottom w:val="single" w:sz="4" w:space="0" w:color="D9D9D9"/>
+              <w:right w:val="single" w:sz="4" w:space="0" w:color="D9D9D9"/>
+            </w:tcBorders>
+            <w:shd w:val="clear" w:color="auto" w:fill="E7EDF2"/>
+            <w:tcMar>
+              <w:top w:w="85" w:type="dxa"/>
+              <w:left w:w="85" w:type="dxa"/>
+              <w:bottom w:w="85" w:type="dxa"/>
+              <w:right w:w="85" w:type="dxa"/>
+            </w:tcMar>
+            <w:vAlign w:val="center"/>
+            <w:hideMark/>
+          </w:tcPr>
+          <w:p>
+            <w:r>
+              <w:rPr>
+                <w:b/>
+                <w:bCs/>
+              </w:rPr>
+              <w:t>Before prompt clarification</w:t>
+            </w:r>
+          </w:p>
+        </w:tc>
+        <w:tc>
+          <w:tcPr>
+            <w:tcW w:w="2088" w:type="dxa"/>
+            <w:tcBorders>
+              <w:top w:val="single" w:sz="4" w:space="0" w:color="D9D9D9"/>
+              <w:left w:val="single" w:sz="4" w:space="0" w:color="D9D9D9"/>
+              <w:bottom w:val="single" w:sz="4" w:space="0" w:color="D9D9D9"/>
+              <w:right w:val="single" w:sz="4" w:space="0" w:color="D9D9D9"/>
+            </w:tcBorders>
+            <w:shd w:val="clear" w:color="auto" w:fill="E7EDF2"/>
+            <w:tcMar>
+              <w:top w:w="85" w:type="dxa"/>
+              <w:left w:w="85" w:type="dxa"/>
+              <w:bottom w:w="85" w:type="dxa"/>
+              <w:right w:w="85" w:type="dxa"/>
+            </w:tcMar>
+            <w:vAlign w:val="center"/>
+            <w:hideMark/>
+          </w:tcPr>
+          <w:p>
+            <w:r>
+              <w:rPr>
+                <w:b/>
+                <w:bCs/>
+              </w:rPr>
+              <w:t>After clarification</w:t>
+            </w:r>
+          </w:p>
+        </w:tc>
+      </w:tr>
+      <w:tr>
+        <w:tc>
+          <w:tcPr>
+            <w:tcW w:w="3600" w:type="dxa"/>
+            <w:tcBorders>
+              <w:top w:val="single" w:sz="4" w:space="0" w:color="D9D9D9"/>
+              <w:left w:val="single" w:sz="4" w:space="0" w:color="D9D9D9"/>
+              <w:bottom w:val="single" w:sz="4" w:space="0" w:color="D9D9D9"/>
+              <w:right w:val="single" w:sz="4" w:space="0" w:color="D9D9D9"/>
+            </w:tcBorders>
+            <w:shd w:val="clear" w:color="auto" w:fill="FFFFFF"/>
+            <w:tcMar>
+              <w:top w:w="85" w:type="dxa"/>
+              <w:left w:w="85" w:type="dxa"/>
+              <w:bottom w:w="85" w:type="dxa"/>
+              <w:right w:w="85" w:type="dxa"/>
+            </w:tcMar>
+            <w:vAlign w:val="center"/>
+            <w:hideMark/>
+          </w:tcPr>
+          <w:p>
+            <w:r>
+              <w:t>Successful attempts</w:t>
+            </w:r>
+          </w:p>
+        </w:tc>
+        <w:tc>
+          <w:tcPr>
+            <w:tcW w:w="1872" w:type="dxa"/>
+            <w:tcBorders>
+              <w:top w:val="single" w:sz="4" w:space="0" w:color="D9D9D9"/>
+              <w:left w:val="single" w:sz="4" w:space="0" w:color="D9D9D9"/>
+              <w:bottom w:val="single" w:sz="4" w:space="0" w:color="D9D9D9"/>
+              <w:right w:val="single" w:sz="4" w:space="0" w:color="D9D9D9"/>
+            </w:tcBorders>
+            <w:shd w:val="clear" w:color="auto" w:fill="FFFFFF"/>
+            <w:tcMar>
+              <w:top w:w="85" w:type="dxa"/>
+              <w:left w:w="85" w:type="dxa"/>
+              <w:bottom w:w="85" w:type="dxa"/>
+              <w:right w:w="85" w:type="dxa"/>
+            </w:tcMar>
+            <w:vAlign w:val="center"/>
+            <w:hideMark/>
+          </w:tcPr>
+          <w:p>
+            <w:r>
+              <w:t>60 / 60</w:t>
+            </w:r>
+          </w:p>
+        </w:tc>
+        <w:tc>
+          <w:tcPr>
+            <w:tcW w:w="2520" w:type="dxa"/>
+            <w:tcBorders>
+              <w:top w:val="single" w:sz="4" w:space="0" w:color="D9D9D9"/>
+              <w:left w:val="single" w:sz="4" w:space="0" w:color="D9D9D9"/>
+              <w:bottom w:val="single" w:sz="4" w:space="0" w:color="D9D9D9"/>
+              <w:right w:val="single" w:sz="4" w:space="0" w:color="D9D9D9"/>
+            </w:tcBorders>
+            <w:shd w:val="clear" w:color="auto" w:fill="FFFFFF"/>
+            <w:tcMar>
+              <w:top w:w="85" w:type="dxa"/>
+              <w:left w:w="85" w:type="dxa"/>
+              <w:bottom w:w="85" w:type="dxa"/>
+              <w:right w:w="85" w:type="dxa"/>
+            </w:tcMar>
+            <w:vAlign w:val="center"/>
+            <w:hideMark/>
+          </w:tcPr>
+          <w:p>
+            <w:r>
+              <w:t>56 / 60</w:t>
+            </w:r>
+          </w:p>
+        </w:tc>
+        <w:tc>
+          <w:tcPr>
+            <w:tcW w:w="2088" w:type="dxa"/>
+            <w:tcBorders>
+              <w:top w:val="single" w:sz="4" w:space="0" w:color="D9D9D9"/>
+              <w:left w:val="single" w:sz="4" w:space="0" w:color="D9D9D9"/>
+              <w:bottom w:val="single" w:sz="4" w:space="0" w:color="D9D9D9"/>
+              <w:right w:val="single" w:sz="4" w:space="0" w:color="D9D9D9"/>
+            </w:tcBorders>
+            <w:shd w:val="clear" w:color="auto" w:fill="FFFFFF"/>
+            <w:tcMar>
+              <w:top w:w="85" w:type="dxa"/>
+              <w:left w:w="85" w:type="dxa"/>
+              <w:bottom w:w="85" w:type="dxa"/>
+              <w:right w:w="85" w:type="dxa"/>
+            </w:tcMar>
+            <w:vAlign w:val="center"/>
+            <w:hideMark/>
+          </w:tcPr>
+          <w:p>
+            <w:r>
+              <w:t>60 / 60</w:t>
+            </w:r>
+          </w:p>
+        </w:tc>
+      </w:tr>
+      <w:tr>
+        <w:tc>
+          <w:tcPr>
+            <w:tcW w:w="3600" w:type="dxa"/>
+            <w:tcBorders>
+              <w:top w:val="single" w:sz="4" w:space="0" w:color="D9D9D9"/>
+              <w:left w:val="single" w:sz="4" w:space="0" w:color="D9D9D9"/>
+              <w:bottom w:val="single" w:sz="4" w:space="0" w:color="D9D9D9"/>
+              <w:right w:val="single" w:sz="4" w:space="0" w:color="D9D9D9"/>
+            </w:tcBorders>
+            <w:shd w:val="clear" w:color="auto" w:fill="F7F8FA"/>
+            <w:tcMar>
+              <w:top w:w="85" w:type="dxa"/>
+              <w:left w:w="85" w:type="dxa"/>
+              <w:bottom w:w="85" w:type="dxa"/>
+              <w:right w:w="85" w:type="dxa"/>
+            </w:tcMar>
+            <w:vAlign w:val="center"/>
+            <w:hideMark/>
+          </w:tcPr>
+          <w:p>
+            <w:r>
+              <w:t>Correct actions across all attempts</w:t>
+            </w:r>
+          </w:p>
+        </w:tc>
+        <w:tc>
+          <w:tcPr>
+            <w:tcW w:w="1872" w:type="dxa"/>
+            <w:tcBorders>
+              <w:top w:val="single" w:sz="4" w:space="0" w:color="D9D9D9"/>
+              <w:left w:val="single" w:sz="4" w:space="0" w:color="D9D9D9"/>
+              <w:bottom w:val="single" w:sz="4" w:space="0" w:color="D9D9D9"/>
+              <w:right w:val="single" w:sz="4" w:space="0" w:color="D9D9D9"/>
+            </w:tcBorders>
+            <w:shd w:val="clear" w:color="auto" w:fill="F7F8FA"/>
+            <w:tcMar>
+              <w:top w:w="85" w:type="dxa"/>
+              <w:left w:w="85" w:type="dxa"/>
+              <w:bottom w:w="85" w:type="dxa"/>
+              <w:right w:w="85" w:type="dxa"/>
+            </w:tcMar>
+            <w:vAlign w:val="center"/>
+            <w:hideMark/>
+          </w:tcPr>
+          <w:p>
+            <w:r>
+              <w:t>60 / 60</w:t>
+            </w:r>
+          </w:p>
+        </w:tc>
+        <w:tc>
+          <w:tcPr>
+            <w:tcW w:w="2520" w:type="dxa"/>
+            <w:tcBorders>
+              <w:top w:val="single" w:sz="4" w:space="0" w:color="D9D9D9"/>
+              <w:left w:val="single" w:sz="4" w:space="0" w:color="D9D9D9"/>
+              <w:bottom w:val="single" w:sz="4" w:space="0" w:color="D9D9D9"/>
+              <w:right w:val="single" w:sz="4" w:space="0" w:color="D9D9D9"/>
+            </w:tcBorders>
+            <w:shd w:val="clear" w:color="auto" w:fill="F7F8FA"/>
+            <w:tcMar>
+              <w:top w:w="85" w:type="dxa"/>
+              <w:left w:w="85" w:type="dxa"/>
+              <w:bottom w:w="85" w:type="dxa"/>
+              <w:right w:w="85" w:type="dxa"/>
+            </w:tcMar>
+            <w:vAlign w:val="center"/>
+            <w:hideMark/>
+          </w:tcPr>
+          <w:p>
+            <w:r>
+              <w:t>56 / 60</w:t>
+            </w:r>
+          </w:p>
+        </w:tc>
+        <w:tc>
+          <w:tcPr>
+            <w:tcW w:w="2088" w:type="dxa"/>
+            <w:tcBorders>
+              <w:top w:val="single" w:sz="4" w:space="0" w:color="D9D9D9"/>
+              <w:left w:val="single" w:sz="4" w:space="0" w:color="D9D9D9"/>
+              <w:bottom w:val="single" w:sz="4" w:space="0" w:color="D9D9D9"/>
+              <w:right w:val="single" w:sz="4" w:space="0" w:color="D9D9D9"/>
+            </w:tcBorders>
+            <w:shd w:val="clear" w:color="auto" w:fill="F7F8FA"/>
+            <w:tcMar>
+              <w:top w:w="85" w:type="dxa"/>
+              <w:left w:w="85" w:type="dxa"/>
+              <w:bottom w:w="85" w:type="dxa"/>
+              <w:right w:w="85" w:type="dxa"/>
+            </w:tcMar>
+            <w:vAlign w:val="center"/>
+            <w:hideMark/>
+          </w:tcPr>
+          <w:p>
+            <w:r>
+              <w:t>60 / 60</w:t>
+            </w:r>
+          </w:p>
+        </w:tc>
+      </w:tr>
+      <w:tr>
+        <w:tc>
+          <w:tcPr>
+            <w:tcW w:w="3600" w:type="dxa"/>
+            <w:tcBorders>
+              <w:top w:val="single" w:sz="4" w:space="0" w:color="D9D9D9"/>
+              <w:left w:val="single" w:sz="4" w:space="0" w:color="D9D9D9"/>
+              <w:bottom w:val="single" w:sz="4" w:space="0" w:color="D9D9D9"/>
+              <w:right w:val="single" w:sz="4" w:space="0" w:color="D9D9D9"/>
+            </w:tcBorders>
+            <w:shd w:val="clear" w:color="auto" w:fill="FFFFFF"/>
+            <w:tcMar>
+              <w:top w:w="85" w:type="dxa"/>
+              <w:left w:w="85" w:type="dxa"/>
+              <w:bottom w:w="85" w:type="dxa"/>
+              <w:right w:w="85" w:type="dxa"/>
+            </w:tcMar>
+            <w:vAlign w:val="center"/>
+            <w:hideMark/>
+          </w:tcPr>
+          <w:p>
+            <w:r>
+              <w:t>Preference matches</w:t>
+            </w:r>
+          </w:p>
+        </w:tc>
+        <w:tc>
+          <w:tcPr>
+            <w:tcW w:w="1872" w:type="dxa"/>
+            <w:tcBorders>
+              <w:top w:val="single" w:sz="4" w:space="0" w:color="D9D9D9"/>
+              <w:left w:val="single" w:sz="4" w:space="0" w:color="D9D9D9"/>
+              <w:bottom w:val="single" w:sz="4" w:space="0" w:color="D9D9D9"/>
+              <w:right w:val="single" w:sz="4" w:space="0" w:color="D9D9D9"/>
+            </w:tcBorders>
+            <w:shd w:val="clear" w:color="auto" w:fill="FFFFFF"/>
+            <w:tcMar>
+              <w:top w:w="85" w:type="dxa"/>
+              <w:left w:w="85" w:type="dxa"/>
+              <w:bottom w:w="85" w:type="dxa"/>
+              <w:right w:w="85" w:type="dxa"/>
+            </w:tcMar>
+            <w:vAlign w:val="center"/>
+            <w:hideMark/>
+          </w:tcPr>
+          <w:p>
+            <w:r>
+              <w:t>29 / 30</w:t>
+            </w:r>
+          </w:p>
+        </w:tc>
+        <w:tc>
+          <w:tcPr>
+            <w:tcW w:w="2520" w:type="dxa"/>
+            <w:tcBorders>
+              <w:top w:val="single" w:sz="4" w:space="0" w:color="D9D9D9"/>
+              <w:left w:val="single" w:sz="4" w:space="0" w:color="D9D9D9"/>
+              <w:bottom w:val="single" w:sz="4" w:space="0" w:color="D9D9D9"/>
+              <w:right w:val="single" w:sz="4" w:space="0" w:color="D9D9D9"/>
+            </w:tcBorders>
+            <w:shd w:val="clear" w:color="auto" w:fill="FFFFFF"/>
+            <w:tcMar>
+              <w:top w:w="85" w:type="dxa"/>
+              <w:left w:w="85" w:type="dxa"/>
+              <w:bottom w:w="85" w:type="dxa"/>
+              <w:right w:w="85" w:type="dxa"/>
+            </w:tcMar>
+            <w:vAlign w:val="center"/>
+            <w:hideMark/>
+          </w:tcPr>
+          <w:p>
+            <w:r>
+              <w:t>26 / 30</w:t>
+            </w:r>
+          </w:p>
+        </w:tc>
+        <w:tc>
+          <w:tcPr>
+            <w:tcW w:w="2088" w:type="dxa"/>
+            <w:tcBorders>
+              <w:top w:val="single" w:sz="4" w:space="0" w:color="D9D9D9"/>
+              <w:left w:val="single" w:sz="4" w:space="0" w:color="D9D9D9"/>
+              <w:bottom w:val="single" w:sz="4" w:space="0" w:color="D9D9D9"/>
+              <w:right w:val="single" w:sz="4" w:space="0" w:color="D9D9D9"/>
+            </w:tcBorders>
+            <w:shd w:val="clear" w:color="auto" w:fill="FFFFFF"/>
+            <w:tcMar>
+              <w:top w:w="85" w:type="dxa"/>
+              <w:left w:w="85" w:type="dxa"/>
+              <w:bottom w:w="85" w:type="dxa"/>
+              <w:right w:w="85" w:type="dxa"/>
+            </w:tcMar>
+            <w:vAlign w:val="center"/>
+            <w:hideMark/>
+          </w:tcPr>
+          <w:p>
+            <w:r>
+              <w:t>30 / 30</w:t>
+            </w:r>
+          </w:p>
+        </w:tc>
+      </w:tr>
+      <w:tr>
+        <w:tc>
+          <w:tcPr>
+            <w:tcW w:w="3600" w:type="dxa"/>
+            <w:tcBorders>
+              <w:top w:val="single" w:sz="4" w:space="0" w:color="D9D9D9"/>
+              <w:left w:val="single" w:sz="4" w:space="0" w:color="D9D9D9"/>
+              <w:bottom w:val="single" w:sz="4" w:space="0" w:color="D9D9D9"/>
+              <w:right w:val="single" w:sz="4" w:space="0" w:color="D9D9D9"/>
+            </w:tcBorders>
+            <w:shd w:val="clear" w:color="auto" w:fill="F7F8FA"/>
+            <w:tcMar>
+              <w:top w:w="85" w:type="dxa"/>
+              <w:left w:w="85" w:type="dxa"/>
+              <w:bottom w:w="85" w:type="dxa"/>
+              <w:right w:w="85" w:type="dxa"/>
+            </w:tcMar>
+            <w:vAlign w:val="center"/>
+            <w:hideMark/>
+          </w:tcPr>
+          <w:p>
+            <w:r>
+              <w:t>Consistent final explanations</w:t>
+            </w:r>
+          </w:p>
+        </w:tc>
+        <w:tc>
+          <w:tcPr>
+            <w:tcW w:w="1872" w:type="dxa"/>
+            <w:tcBorders>
+              <w:top w:val="single" w:sz="4" w:space="0" w:color="D9D9D9"/>
+              <w:left w:val="single" w:sz="4" w:space="0" w:color="D9D9D9"/>
+              <w:bottom w:val="single" w:sz="4" w:space="0" w:color="D9D9D9"/>
+              <w:right w:val="single" w:sz="4" w:space="0" w:color="D9D9D9"/>
+            </w:tcBorders>
+            <w:shd w:val="clear" w:color="auto" w:fill="F7F8FA"/>
+            <w:tcMar>
+              <w:top w:w="85" w:type="dxa"/>
+              <w:left w:w="85" w:type="dxa"/>
+              <w:bottom w:w="85" w:type="dxa"/>
+              <w:right w:w="85" w:type="dxa"/>
+            </w:tcMar>
+            <w:vAlign w:val="center"/>
+            <w:hideMark/>
+          </w:tcPr>
+          <w:p>
+            <w:r>
+              <w:t>Not scored</w:t>
+            </w:r>
+          </w:p>
+        </w:tc>
+        <w:tc>
+          <w:tcPr>
+            <w:tcW w:w="2520" w:type="dxa"/>
+            <w:tcBorders>
+              <w:top w:val="single" w:sz="4" w:space="0" w:color="D9D9D9"/>
+              <w:left w:val="single" w:sz="4" w:space="0" w:color="D9D9D9"/>
+              <w:bottom w:val="single" w:sz="4" w:space="0" w:color="D9D9D9"/>
+              <w:right w:val="single" w:sz="4" w:space="0" w:color="D9D9D9"/>
+            </w:tcBorders>
+            <w:shd w:val="clear" w:color="auto" w:fill="F7F8FA"/>
+            <w:tcMar>
+              <w:top w:w="85" w:type="dxa"/>
+              <w:left w:w="85" w:type="dxa"/>
+              <w:bottom w:w="85" w:type="dxa"/>
+              <w:right w:w="85" w:type="dxa"/>
+            </w:tcMar>
+            <w:vAlign w:val="center"/>
+            <w:hideMark/>
+          </w:tcPr>
+          <w:p>
+            <w:r>
+              <w:t>56 / 60</w:t>
+            </w:r>
+          </w:p>
+        </w:tc>
+        <w:tc>
+          <w:tcPr>
+            <w:tcW w:w="2088" w:type="dxa"/>
+            <w:tcBorders>
+              <w:top w:val="single" w:sz="4" w:space="0" w:color="D9D9D9"/>
+              <w:left w:val="single" w:sz="4" w:space="0" w:color="D9D9D9"/>
+              <w:bottom w:val="single" w:sz="4" w:space="0" w:color="D9D9D9"/>
+              <w:right w:val="single" w:sz="4" w:space="0" w:color="D9D9D9"/>
+            </w:tcBorders>
+            <w:shd w:val="clear" w:color="auto" w:fill="F7F8FA"/>
+            <w:tcMar>
+              <w:top w:w="85" w:type="dxa"/>
+              <w:left w:w="85" w:type="dxa"/>
+              <w:bottom w:w="85" w:type="dxa"/>
+              <w:right w:w="85" w:type="dxa"/>
+            </w:tcMar>
+            <w:vAlign w:val="center"/>
+            <w:hideMark/>
+          </w:tcPr>
+          <w:p>
+            <w:r>
+              <w:t>60 / 60</w:t>
+            </w:r>
+          </w:p>
+        </w:tc>
+      </w:tr>
+      <w:tr>
+        <w:tc>
+          <w:tcPr>
+            <w:tcW w:w="3600" w:type="dxa"/>
+            <w:tcBorders>
+              <w:top w:val="single" w:sz="4" w:space="0" w:color="D9D9D9"/>
+              <w:left w:val="single" w:sz="4" w:space="0" w:color="D9D9D9"/>
+              <w:bottom w:val="single" w:sz="4" w:space="0" w:color="D9D9D9"/>
+              <w:right w:val="single" w:sz="4" w:space="0" w:color="D9D9D9"/>
+            </w:tcBorders>
+            <w:shd w:val="clear" w:color="auto" w:fill="FFFFFF"/>
+            <w:tcMar>
+              <w:top w:w="85" w:type="dxa"/>
+              <w:left w:w="85" w:type="dxa"/>
+              <w:bottom w:w="85" w:type="dxa"/>
+              <w:right w:w="85" w:type="dxa"/>
+            </w:tcMar>
+            <w:vAlign w:val="center"/>
+            <w:hideMark/>
+          </w:tcPr>
+          <w:p>
+            <w:r>
+              <w:t>Consistency among accepted proposals</w:t>
+            </w:r>
+          </w:p>
+        </w:tc>
+        <w:tc>
+          <w:tcPr>
+            <w:tcW w:w="1872" w:type="dxa"/>
+            <w:tcBorders>
+              <w:top w:val="single" w:sz="4" w:space="0" w:color="D9D9D9"/>
+              <w:left w:val="single" w:sz="4" w:space="0" w:color="D9D9D9"/>
+              <w:bottom w:val="single" w:sz="4" w:space="0" w:color="D9D9D9"/>
+              <w:right w:val="single" w:sz="4" w:space="0" w:color="D9D9D9"/>
+            </w:tcBorders>
+            <w:shd w:val="clear" w:color="auto" w:fill="FFFFFF"/>
+            <w:tcMar>
+              <w:top w:w="85" w:type="dxa"/>
+              <w:left w:w="85" w:type="dxa"/>
+              <w:bottom w:w="85" w:type="dxa"/>
+              <w:right w:w="85" w:type="dxa"/>
+            </w:tcMar>
+            <w:vAlign w:val="center"/>
+            <w:hideMark/>
+          </w:tcPr>
+          <w:p>
+            <w:r>
+              <w:t>Not scored</w:t>
+            </w:r>
+          </w:p>
+        </w:tc>
+        <w:tc>
+          <w:tcPr>
+            <w:tcW w:w="2520" w:type="dxa"/>
+            <w:tcBorders>
+              <w:top w:val="single" w:sz="4" w:space="0" w:color="D9D9D9"/>
+              <w:left w:val="single" w:sz="4" w:space="0" w:color="D9D9D9"/>
+              <w:bottom w:val="single" w:sz="4" w:space="0" w:color="D9D9D9"/>
+              <w:right w:val="single" w:sz="4" w:space="0" w:color="D9D9D9"/>
+            </w:tcBorders>
+            <w:shd w:val="clear" w:color="auto" w:fill="FFFFFF"/>
+            <w:tcMar>
+              <w:top w:w="85" w:type="dxa"/>
+              <w:left w:w="85" w:type="dxa"/>
+              <w:bottom w:w="85" w:type="dxa"/>
+              <w:right w:w="85" w:type="dxa"/>
+            </w:tcMar>
+            <w:vAlign w:val="center"/>
+            <w:hideMark/>
+          </w:tcPr>
+          <w:p>
+            <w:r>
+              <w:t>100%</w:t>
+            </w:r>
+          </w:p>
+        </w:tc>
+        <w:tc>
+          <w:tcPr>
+            <w:tcW w:w="2088" w:type="dxa"/>
+            <w:tcBorders>
+              <w:top w:val="single" w:sz="4" w:space="0" w:color="D9D9D9"/>
+              <w:left w:val="single" w:sz="4" w:space="0" w:color="D9D9D9"/>
+              <w:bottom w:val="single" w:sz="4" w:space="0" w:color="D9D9D9"/>
+              <w:right w:val="single" w:sz="4" w:space="0" w:color="D9D9D9"/>
+            </w:tcBorders>
+            <w:shd w:val="clear" w:color="auto" w:fill="FFFFFF"/>
+            <w:tcMar>
+              <w:top w:w="85" w:type="dxa"/>
+              <w:left w:w="85" w:type="dxa"/>
+              <w:bottom w:w="85" w:type="dxa"/>
+              <w:right w:w="85" w:type="dxa"/>
+            </w:tcMar>
+            <w:vAlign w:val="center"/>
+            <w:hideMark/>
+          </w:tcPr>
+          <w:p>
+            <w:r>
+              <w:t>100%</w:t>
+            </w:r>
+          </w:p>
+        </w:tc>
+      </w:tr>
+      <w:tr>
+        <w:tc>
+          <w:tcPr>
+            <w:tcW w:w="3600" w:type="dxa"/>
+            <w:tcBorders>
+              <w:top w:val="single" w:sz="4" w:space="0" w:color="D9D9D9"/>
+              <w:left w:val="single" w:sz="4" w:space="0" w:color="D9D9D9"/>
+              <w:bottom w:val="single" w:sz="4" w:space="0" w:color="D9D9D9"/>
+              <w:right w:val="single" w:sz="4" w:space="0" w:color="D9D9D9"/>
+            </w:tcBorders>
+            <w:shd w:val="clear" w:color="auto" w:fill="F7F8FA"/>
+            <w:tcMar>
+              <w:top w:w="85" w:type="dxa"/>
+              <w:left w:w="85" w:type="dxa"/>
+              <w:bottom w:w="85" w:type="dxa"/>
+              <w:right w:w="85" w:type="dxa"/>
+            </w:tcMar>
+            <w:vAlign w:val="center"/>
+            <w:hideMark/>
+          </w:tcPr>
+          <w:p>
+            <w:r>
+              <w:t>Average duration</w:t>
+            </w:r>
+          </w:p>
+        </w:tc>
+        <w:tc>
+          <w:tcPr>
+            <w:tcW w:w="1872" w:type="dxa"/>
+            <w:tcBorders>
+              <w:top w:val="single" w:sz="4" w:space="0" w:color="D9D9D9"/>
+              <w:left w:val="single" w:sz="4" w:space="0" w:color="D9D9D9"/>
+              <w:bottom w:val="single" w:sz="4" w:space="0" w:color="D9D9D9"/>
+              <w:right w:val="single" w:sz="4" w:space="0" w:color="D9D9D9"/>
+            </w:tcBorders>
+            <w:shd w:val="clear" w:color="auto" w:fill="F7F8FA"/>
+            <w:tcMar>
+              <w:top w:w="85" w:type="dxa"/>
+              <w:left w:w="85" w:type="dxa"/>
+              <w:bottom w:w="85" w:type="dxa"/>
+              <w:right w:w="85" w:type="dxa"/>
+            </w:tcMar>
+            <w:vAlign w:val="center"/>
+            <w:hideMark/>
+          </w:tcPr>
+          <w:p>
+            <w:r>
+              <w:t xml:space="preserve">1589.90 </w:t>
+            </w:r>
+            <w:proofErr w:type="spellStart"/>
+            <w:r>
+              <w:t>ms</w:t>
+            </w:r>
+            <w:proofErr w:type="spellEnd"/>
+          </w:p>
+        </w:tc>
+        <w:tc>
+          <w:tcPr>
+            <w:tcW w:w="2520" w:type="dxa"/>
+            <w:tcBorders>
+              <w:top w:val="single" w:sz="4" w:space="0" w:color="D9D9D9"/>
+              <w:left w:val="single" w:sz="4" w:space="0" w:color="D9D9D9"/>
+              <w:bottom w:val="single" w:sz="4" w:space="0" w:color="D9D9D9"/>
+              <w:right w:val="single" w:sz="4" w:space="0" w:color="D9D9D9"/>
+            </w:tcBorders>
+            <w:shd w:val="clear" w:color="auto" w:fill="F7F8FA"/>
+            <w:tcMar>
+              <w:top w:w="85" w:type="dxa"/>
+              <w:left w:w="85" w:type="dxa"/>
+              <w:bottom w:w="85" w:type="dxa"/>
+              <w:right w:w="85" w:type="dxa"/>
+            </w:tcMar>
+            <w:vAlign w:val="center"/>
+            <w:hideMark/>
+          </w:tcPr>
+          <w:p>
+            <w:r>
+              <w:t xml:space="preserve">1466.27 </w:t>
+            </w:r>
+            <w:proofErr w:type="spellStart"/>
+            <w:r>
+              <w:t>ms</w:t>
+            </w:r>
+            <w:proofErr w:type="spellEnd"/>
+          </w:p>
+        </w:tc>
+        <w:tc>
+          <w:tcPr>
+            <w:tcW w:w="2088" w:type="dxa"/>
+            <w:tcBorders>
+              <w:top w:val="single" w:sz="4" w:space="0" w:color="D9D9D9"/>
+              <w:left w:val="single" w:sz="4" w:space="0" w:color="D9D9D9"/>
+              <w:bottom w:val="single" w:sz="4" w:space="0" w:color="D9D9D9"/>
+              <w:right w:val="single" w:sz="4" w:space="0" w:color="D9D9D9"/>
+            </w:tcBorders>
+            <w:shd w:val="clear" w:color="auto" w:fill="F7F8FA"/>
+            <w:tcMar>
+              <w:top w:w="85" w:type="dxa"/>
+              <w:left w:w="85" w:type="dxa"/>
+              <w:bottom w:w="85" w:type="dxa"/>
+              <w:right w:w="85" w:type="dxa"/>
+            </w:tcMar>
+            <w:vAlign w:val="center"/>
+            <w:hideMark/>
+          </w:tcPr>
+          <w:p>
+            <w:r>
+              <w:t xml:space="preserve">1343.00 </w:t>
+            </w:r>
+            <w:proofErr w:type="spellStart"/>
+            <w:r>
+              <w:t>ms</w:t>
+            </w:r>
+            <w:proofErr w:type="spellEnd"/>
+          </w:p>
+        </w:tc>
+      </w:tr>
+      <w:tr>
+        <w:tc>
+          <w:tcPr>
+            <w:tcW w:w="3600" w:type="dxa"/>
+            <w:tcBorders>
+              <w:top w:val="single" w:sz="4" w:space="0" w:color="D9D9D9"/>
+              <w:left w:val="single" w:sz="4" w:space="0" w:color="D9D9D9"/>
+              <w:bottom w:val="single" w:sz="4" w:space="0" w:color="D9D9D9"/>
+              <w:right w:val="single" w:sz="4" w:space="0" w:color="D9D9D9"/>
+            </w:tcBorders>
+            <w:shd w:val="clear" w:color="auto" w:fill="FFFFFF"/>
+            <w:tcMar>
+              <w:top w:w="85" w:type="dxa"/>
+              <w:left w:w="85" w:type="dxa"/>
+              <w:bottom w:w="85" w:type="dxa"/>
+              <w:right w:w="85" w:type="dxa"/>
+            </w:tcMar>
+            <w:vAlign w:val="center"/>
+            <w:hideMark/>
+          </w:tcPr>
+          <w:p>
+            <w:r>
+              <w:lastRenderedPageBreak/>
+              <w:t>Average process memory afterward</w:t>
+            </w:r>
+          </w:p>
+        </w:tc>
+        <w:tc>
+          <w:tcPr>
+            <w:tcW w:w="1872" w:type="dxa"/>
+            <w:tcBorders>
+              <w:top w:val="single" w:sz="4" w:space="0" w:color="D9D9D9"/>
+              <w:left w:val="single" w:sz="4" w:space="0" w:color="D9D9D9"/>
+              <w:bottom w:val="single" w:sz="4" w:space="0" w:color="D9D9D9"/>
+              <w:right w:val="single" w:sz="4" w:space="0" w:color="D9D9D9"/>
+            </w:tcBorders>
+            <w:shd w:val="clear" w:color="auto" w:fill="FFFFFF"/>
+            <w:tcMar>
+              <w:top w:w="85" w:type="dxa"/>
+              <w:left w:w="85" w:type="dxa"/>
+              <w:bottom w:w="85" w:type="dxa"/>
+              <w:right w:w="85" w:type="dxa"/>
+            </w:tcMar>
+            <w:vAlign w:val="center"/>
+            <w:hideMark/>
+          </w:tcPr>
+          <w:p>
+            <w:r>
+              <w:t>99.58 MB</w:t>
+            </w:r>
+          </w:p>
+        </w:tc>
+        <w:tc>
+          <w:tcPr>
+            <w:tcW w:w="2520" w:type="dxa"/>
+            <w:tcBorders>
+              <w:top w:val="single" w:sz="4" w:space="0" w:color="D9D9D9"/>
+              <w:left w:val="single" w:sz="4" w:space="0" w:color="D9D9D9"/>
+              <w:bottom w:val="single" w:sz="4" w:space="0" w:color="D9D9D9"/>
+              <w:right w:val="single" w:sz="4" w:space="0" w:color="D9D9D9"/>
+            </w:tcBorders>
+            <w:shd w:val="clear" w:color="auto" w:fill="FFFFFF"/>
+            <w:tcMar>
+              <w:top w:w="85" w:type="dxa"/>
+              <w:left w:w="85" w:type="dxa"/>
+              <w:bottom w:w="85" w:type="dxa"/>
+              <w:right w:w="85" w:type="dxa"/>
+            </w:tcMar>
+            <w:vAlign w:val="center"/>
+            <w:hideMark/>
+          </w:tcPr>
+          <w:p>
+            <w:r>
+              <w:t>99.75 MB</w:t>
+            </w:r>
+          </w:p>
+        </w:tc>
+        <w:tc>
+          <w:tcPr>
+            <w:tcW w:w="2088" w:type="dxa"/>
+            <w:tcBorders>
+              <w:top w:val="single" w:sz="4" w:space="0" w:color="D9D9D9"/>
+              <w:left w:val="single" w:sz="4" w:space="0" w:color="D9D9D9"/>
+              <w:bottom w:val="single" w:sz="4" w:space="0" w:color="D9D9D9"/>
+              <w:right w:val="single" w:sz="4" w:space="0" w:color="D9D9D9"/>
+            </w:tcBorders>
+            <w:shd w:val="clear" w:color="auto" w:fill="FFFFFF"/>
+            <w:tcMar>
+              <w:top w:w="85" w:type="dxa"/>
+              <w:left w:w="85" w:type="dxa"/>
+              <w:bottom w:w="85" w:type="dxa"/>
+              <w:right w:w="85" w:type="dxa"/>
+            </w:tcMar>
+            <w:vAlign w:val="center"/>
+            <w:hideMark/>
+          </w:tcPr>
+          <w:p>
+            <w:r>
+              <w:t>99.43 MB</w:t>
+            </w:r>
+          </w:p>
+        </w:tc>
+      </w:tr>
+    </w:tbl>
+    <w:p>
+      <w:r>
+        <w:t>Failed attempts remain in the denominators for action accuracy, applicable preference alignment, and all-attempt explanation consistency. Accepted-proposal explanation consistency excludes failed attempts. In the intermediate run, 56 of 56 returned explanations passed while four attempts returned no valid proposal.</w:t>
+      </w:r>
+    </w:p>
+    <w:p>
       <w:r>
         <w:t>Discussion</w:t>
       </w:r>
     </w:p>
     <w:p>
       <w:r>
-        <w:t xml:space="preserve">The topic extractor completed all nine attempts. Precision, recall, and F1 </w:t>
-      </w:r>
-      <w:proofErr w:type="gramStart"/>
-      <w:r>
-        <w:t>were each</w:t>
-      </w:r>
-      <w:proofErr w:type="gramEnd"/>
-      <w:r>
-        <w:t xml:space="preserve"> approximately 0.926. These scores use normalized title matching; a correct topic expressed with different wording may be counted as a mismatch, so the scores do not fully measure semantic equivalence.</w:t>
+        <w:t>Explanation reliability</w:t>
+      </w:r>
+    </w:p>
+    <w:p>
+      <w:r>
+        <w:t>The original issue was a factual contradiction in free text: the AI could recommend a valid higher limit while claiming that a feasible current limit was insufficient. Correct action scores therefore did not establish explanation accuracy.</w:t>
+      </w:r>
+    </w:p>
+    <w:p>
+      <w:r>
+        <w:t xml:space="preserve">Python now calculates current-limit feasibility, finish dates, and days saved before requesting a proposal. The tool requires a structured </w:t>
+      </w:r>
+      <w:proofErr w:type="spellStart"/>
+      <w:r>
+        <w:t>limit_change_type</w:t>
+      </w:r>
+      <w:proofErr w:type="spellEnd"/>
+      <w:r>
+        <w:t xml:space="preserve"> claim: </w:t>
+      </w:r>
+      <w:proofErr w:type="spellStart"/>
+      <w:r>
+        <w:t>not_needed</w:t>
+      </w:r>
+      <w:proofErr w:type="spellEnd"/>
+      <w:r>
+        <w:t>, preference, or required. Python checks that classification against the scheduling options and applies the specified contradictory-wording check.</w:t>
+      </w:r>
+    </w:p>
+    <w:p>
+      <w:r>
+        <w:t>When an initial decision is valid but its explanation fails, the agent requests one repair. The repair must preserve the validated action and daily limit. If repair fails, the original validated choice is retained. Invalid initial decisions are rejected rather than repaired by this explanation-only retry.</w:t>
+      </w:r>
+    </w:p>
+    <w:p>
+      <w:r>
+        <w:t>Every final explanation is generated by Python from the validated choice and scheduling facts. The application does not display unrestricted model-written reasoning, even if it passes the initial checks. This is stricter than combining code-generated facts with a model-written reasoning sentence. The AI continues to choose the recommendation.</w:t>
+      </w:r>
+    </w:p>
+    <w:p>
+      <w:r>
+        <w:t>Final explanation scoring</w:t>
+      </w:r>
+    </w:p>
+    <w:p>
+      <w:r>
+        <w:t xml:space="preserve">The new </w:t>
+      </w:r>
+      <w:proofErr w:type="spellStart"/>
+      <w:r>
+        <w:t>explanation_consistent</w:t>
+      </w:r>
+      <w:proofErr w:type="spellEnd"/>
+      <w:r>
+        <w:t xml:space="preserve"> metric checks required template statements, daily limits, dates, days saved, and optional-versus-required wording. It also detects missing or unexpected numeric values and dates. The evaluator reuses the claim checks and independently compares output with scheduling options; it does not call the application explanation builder to obtain an expected answer.</w:t>
+      </w:r>
+    </w:p>
+    <w:p>
+      <w:r>
+        <w:t>This metric evaluates final application output, not raw AI explanation accuracy. The structured classification is checked within the agent but is not retained in the returned proposal. Raw outputs, rejected text, repair counts, and initial explanation failure rates are not captured in the saved reports.</w:t>
       </w:r>
     </w:p>
     <w:p>
       <w:r>
         <w:lastRenderedPageBreak/>
-        <w:t>The average response time was about 1.47 seconds for this evaluation. This may be suitable for interactive use, but actual response times can vary with network conditions and OpenAI service availability. The operation is not guaranteed to meet a strict real-time deadline.</w:t>
-      </w:r>
-    </w:p>
-    <w:p>
-      <w:r>
-        <w:t>The reported average memory after an attempt is the resident memory of the whole Python process. The average change is a before-and-after sample, not peak usage. The figures therefore should not be interpreted as memory used by the AI model alone.</w:t>
-      </w:r>
-    </w:p>
-    <w:p>
-      <w:pPr>
-        <w:numPr>
-          <w:ilvl w:val="0"/>
-          <w:numId w:val="6"/>
-        </w:numPr>
-      </w:pPr>
+        <w:t>Action selection failures</w:t>
+      </w:r>
+    </w:p>
+    <w:p>
+      <w:r>
+        <w:t xml:space="preserve">Four intermediate attempts in the missed-work manageable-workload scenario selected </w:t>
+      </w:r>
+      <w:proofErr w:type="spellStart"/>
+      <w:r>
+        <w:t>keep_current_plan</w:t>
+      </w:r>
+      <w:proofErr w:type="spellEnd"/>
+      <w:r>
+        <w:t xml:space="preserve"> despite missed or overdue work. The existing validator rejected them. The prompt was clarified to distinguish keeping a daily limit from keeping existing session dates. Those failures did not recur in the next 60 attempts. The repeated result is encouraging but does not guarantee future compliance.</w:t>
+      </w:r>
+    </w:p>
+    <w:p>
       <w:r>
         <w:t>Limitations and Possible Improvements</w:t>
       </w:r>
     </w:p>
     <w:p>
       <w:r>
-        <w:t>The evaluation used only three synthetic cases and nine attempts, so it is a small sample and may not represent real course syllabi. The title comparison uses case and whitespace normalization, not semantic matching. Memory was sampled before and after each request rather than continuously.</w:t>
-      </w:r>
-    </w:p>
-    <w:p>
-      <w:r>
-        <w:t>Future evaluation could use a larger set of real or representative syllabi, include human-reviewed semantic scoring, run more repetitions, and record peak memory. Response times could also be measured under different network conditions and workloads.</w:t>
-      </w:r>
-    </w:p>
-    <w:p>
-      <w:pPr>
-        <w:numPr>
-          <w:ilvl w:val="0"/>
-          <w:numId w:val="7"/>
-        </w:numPr>
-      </w:pPr>
+        <w:t>The evaluations use small synthetic datasets. Reusing the same scenarios during prompt refinement makes these development results rather than independent held-out evidence. Repetitions show variation within the selected scenarios but do not broaden their coverage.</w:t>
+      </w:r>
+    </w:p>
+    <w:p>
+      <w:r>
+        <w:t>Final explanation checks target the factual patterns generated by the application. They are not a general natural-language verification system. Correct templates still depend on correct scheduling data and implementation. Passing tests and evaluation attempts cannot establish the absence of all bugs or misclassifications.</w:t>
+      </w:r>
+    </w:p>
+    <w:p>
+      <w:r>
+        <w:t>API, network, database, and other untested failures remain possible. A live review can make one initial request and one explanation-repair request. Invalid initial choices can still cause a rejected review. The evaluator exit status indicates request failures; quality metrics must be inspected separately.</w:t>
+      </w:r>
+    </w:p>
+    <w:p>
+      <w:r>
+        <w:t>Further work should add unseen representative syllabi and review scenarios, document human assessment of recommendation quality, and separately record raw explanation failures and repair outcomes if raw-model reliability is to be measured. Peak process memory and performance under varied workloads would require additional instrumentation.</w:t>
+      </w:r>
+    </w:p>
+    <w:p>
       <w:r>
         <w:t>Conclusion</w:t>
       </w:r>
     </w:p>
     <w:p>
       <w:r>
-        <w:t>In the included evaluation, topic extraction succeeded in all nine attempts, with micro F1 of approximately 0.926 and an average response time of approximately 1.47 seconds. These results are an initial evaluation of a small synthetic dataset; broader testing is needed before drawing conclusions about performance on varied real-world syllabi.</w:t>
+        <w:t xml:space="preserve">The latest development run completed all 60 attempts with 60 correct actions, 30 of 30 preference matches, and 60 final explanations passing the implemented consistency checks. Average duration was 1343 </w:t>
+      </w:r>
+      <w:proofErr w:type="spellStart"/>
+      <w:r>
+        <w:t>ms.</w:t>
+      </w:r>
+      <w:proofErr w:type="spellEnd"/>
+      <w:r>
+        <w:t xml:space="preserve"> The explanation issue is addressed through code-generated facts and validation. These results support the tested implementation on the evaluated scenarios; they do not establish perfect future performance.</w:t>
+      </w:r>
+    </w:p>
+    <w:p>
+      <w:r>
+        <w:t>Report References</w:t>
+      </w:r>
+    </w:p>
+    <w:p>
+      <w:r>
+        <w:t>All JSON files below are under evaluation/results/ in the repository. They preserve the development history and should remain available alongside this report.</w:t>
+      </w:r>
+    </w:p>
+    <w:p>
+      <w:r>
+        <w:rPr>
+          <w:b/>
+          <w:bCs/>
+        </w:rPr>
+        <w:lastRenderedPageBreak/>
+        <w:t>Expanded topic evaluation</w:t>
+      </w:r>
+      <w:r>
+        <w:rPr>
+          <w:b/>
+          <w:bCs/>
+        </w:rPr>
+        <w:br/>
+      </w:r>
+      <w:r>
+        <w:t>topic_evaluation_20261015T192749345674Z.json</w:t>
+      </w:r>
+    </w:p>
+    <w:p>
+      <w:r>
+        <w:rPr>
+          <w:b/>
+          <w:bCs/>
+        </w:rPr>
+        <w:t>October 16 baseline</w:t>
+      </w:r>
+      <w:r>
+        <w:rPr>
+          <w:b/>
+          <w:bCs/>
+        </w:rPr>
+        <w:br/>
+      </w:r>
+      <w:r>
+        <w:t>plan_review_evaluation_20261016T195134480567Z.json</w:t>
+      </w:r>
+    </w:p>
+    <w:p>
+      <w:r>
+        <w:rPr>
+          <w:b/>
+          <w:bCs/>
+        </w:rPr>
+        <w:t>Before action prompt clarification</w:t>
+      </w:r>
+      <w:r>
+        <w:rPr>
+          <w:b/>
+          <w:bCs/>
+        </w:rPr>
+        <w:br/>
+      </w:r>
+      <w:r>
+        <w:t>plan_review_evaluation_20261016T202014831810Z.json</w:t>
+      </w:r>
+    </w:p>
+    <w:p>
+      <w:r>
+        <w:rPr>
+          <w:b/>
+          <w:bCs/>
+        </w:rPr>
+        <w:t>Latest evaluation after clarification</w:t>
+      </w:r>
+      <w:r>
+        <w:rPr>
+          <w:b/>
+          <w:bCs/>
+        </w:rPr>
+        <w:br/>
+      </w:r>
+      <w:r>
+        <w:t>plan_review_evaluation_20261016T202401271876Z.json</w:t>
+      </w:r>
+    </w:p>
+    <w:p>
+      <w:r>
+        <w:t xml:space="preserve">Reproduce the review evaluation from the activated project environment with: python -m </w:t>
+      </w:r>
+      <w:proofErr w:type="spellStart"/>
+      <w:r>
+        <w:t>evaluation.run_plan_review_evaluation</w:t>
+      </w:r>
+      <w:proofErr w:type="spellEnd"/>
+      <w:r>
+        <w:t xml:space="preserve"> --repetitions 10. With six scenarios, this runs 60 attempts and uses API credit. Automated tests use mocked OpenAI calls and were confirmed passing during the October 16 update workflow.</w:t>
       </w:r>
     </w:p>
     <w:p/>

</xml_diff>